<commit_message>
prereqs: one-command Windows and Linux setup; drop xcode-select step
- scripts/install-windows.ps1: paste-one-line PowerShell setup. Turns on
  WSL2 (asks for admin only for that), installs Ubuntu, then hands over to
  install-ubuntu.sh. Re-runnable: after the restart it carries on.
- scripts/install-ubuntu.sh: apt packages, Node 22 (nvm), uv, Claude Code,
  clones the reference app, runs setup.sh (output logged) and preflight.
  Tested end to end and re-run in a clean Ubuntu 24.04 container.
- Prerequisites (md + docx): Windows is now one command (Step 3B), new
  Linux one-liner (3C); Mac drops xcode-select (Homebrew installs the
  command-line tools) and gains an xcrun troubleshooting row.

Co-Authored-By: Claude Opus 5.5 <noreply@anthropic.com>
</commit_message>
<xml_diff>
--- a/docs/TCA Prerequisites.docx
+++ b/docs/TCA Prerequisites.docx
@@ -993,7 +993,7 @@
                 <w:sz w:val="18"/>
                 <w:szCs w:val="18"/>
               </w:rPr>
-              <w:t xml:space="preserve">Windows, and you can run things as Administrator</w:t>
+              <w:t xml:space="preserve">Windows</w:t>
             </w:r>
           </w:p>
         </w:tc>
@@ -1020,7 +1020,7 @@
                 <w:sz w:val="18"/>
                 <w:szCs w:val="18"/>
               </w:rPr>
-              <w:t xml:space="preserve"> (WSL, which gives you a Linux terminal inside Windows)</w:t>
+              <w:t xml:space="preserve">: one command does everything</w:t>
             </w:r>
           </w:p>
         </w:tc>
@@ -1043,7 +1043,7 @@
                 <w:sz w:val="18"/>
                 <w:szCs w:val="18"/>
               </w:rPr>
-              <w:t xml:space="preserve">Windows, no admin rights, or a locked-down work laptop</w:t>
+              <w:t xml:space="preserve">Windows work laptop where you cannot approve "allow this app to make changes"</w:t>
             </w:r>
           </w:p>
         </w:tc>
@@ -1100,7 +1100,7 @@
                 <w:sz w:val="18"/>
                 <w:szCs w:val="18"/>
               </w:rPr>
-              <w:t xml:space="preserve">Linux</w:t>
+              <w:t xml:space="preserve">Linux (Ubuntu or Debian)</w:t>
             </w:r>
           </w:p>
         </w:tc>
@@ -1115,10 +1115,19 @@
             </w:pPr>
             <w:r>
               <w:rPr>
-                <w:sz w:val="18"/>
-                <w:szCs w:val="18"/>
-              </w:rPr>
-              <w:t xml:space="preserve">Step 3B from "Inside Ubuntu" onwards, using your own package manager</w:t>
+                <w:b/>
+                <w:bCs/>
+                <w:sz w:val="18"/>
+                <w:szCs w:val="18"/>
+              </w:rPr>
+              <w:t xml:space="preserve">Step 3C</w:t>
+            </w:r>
+            <w:r>
+              <w:rPr>
+                <w:sz w:val="18"/>
+                <w:szCs w:val="18"/>
+              </w:rPr>
+              <w:t xml:space="preserve">: one command does everything</w:t>
             </w:r>
           </w:p>
         </w:tc>
@@ -1174,10 +1183,10 @@
           <w:b/>
           <w:bCs/>
         </w:rPr>
-        <w:t xml:space="preserve">1. Apple's developer tools</w:t>
-      </w:r>
-      <w:r>
-        <w:t xml:space="preserve"> (gives you </w:t>
+        <w:t xml:space="preserve">1. Homebrew</w:t>
+      </w:r>
+      <w:r>
+        <w:t xml:space="preserve">, the Mac package installer. Skip this if </w:t>
       </w:r>
       <w:r>
         <w:rPr>
@@ -1185,10 +1194,10 @@
           <w:sz w:val="20"/>
           <w:szCs w:val="20"/>
         </w:rPr>
-        <w:t xml:space="preserve">git</w:t>
-      </w:r>
-      <w:r>
-        <w:t xml:space="preserve"> and </w:t>
+        <w:t xml:space="preserve">brew --version</w:t>
+      </w:r>
+      <w:r>
+        <w:t xml:space="preserve"> already prints a version. It asks for your Mac password, and it also installs Apple's developer tools (</w:t>
       </w:r>
       <w:r>
         <w:rPr>
@@ -1196,10 +1205,21 @@
           <w:sz w:val="20"/>
           <w:szCs w:val="20"/>
         </w:rPr>
+        <w:t xml:space="preserve">git</w:t>
+      </w:r>
+      <w:r>
+        <w:t xml:space="preserve"> and </w:t>
+      </w:r>
+      <w:r>
+        <w:rPr>
+          <w:rFonts w:ascii="Consolas" w:hAnsi="Consolas" w:cs="Consolas"/>
+          <w:sz w:val="20"/>
+          <w:szCs w:val="20"/>
+        </w:rPr>
         <w:t xml:space="preserve">make</w:t>
       </w:r>
       <w:r>
-        <w:t xml:space="preserve">). A window pops up; click Install. Skip this if it says they are already installed.</w:t>
+        <w:t xml:space="preserve">), so on a new Mac it can sit quietly for 5 to 10 minutes. Let it run.</w:t>
       </w:r>
     </w:p>
     <w:p>
@@ -1263,7 +1283,7 @@
                 <w:sz w:val="18"/>
                 <w:szCs w:val="18"/>
               </w:rPr>
-              <w:t xml:space="preserve">xcode-select --install</w:t>
+              <w:t xml:space="preserve">/bin/bash -c "$(curl -fsSL https://raw.githubusercontent.com/Homebrew/install/HEAD/install.sh)"</w:t>
             </w:r>
           </w:p>
         </w:tc>
@@ -1279,25 +1299,39 @@
         <w:spacing w:after="140" w:line="276" w:lineRule="auto"/>
       </w:pPr>
       <w:r>
-        <w:rPr>
-          <w:b/>
-          <w:bCs/>
-        </w:rPr>
-        <w:t xml:space="preserve">2. Homebrew</w:t>
-      </w:r>
-      <w:r>
-        <w:t xml:space="preserve">, the Mac package installer. Skip this if </w:t>
-      </w:r>
-      <w:r>
-        <w:rPr>
-          <w:rFonts w:ascii="Consolas" w:hAnsi="Consolas" w:cs="Consolas"/>
-          <w:sz w:val="20"/>
-          <w:szCs w:val="20"/>
-        </w:rPr>
-        <w:t xml:space="preserve">brew --version</w:t>
-      </w:r>
-      <w:r>
-        <w:t xml:space="preserve"> already prints a version. It asks for your Mac password.</w:t>
+        <w:t xml:space="preserve">When it finishes, it prints two or three lines under </w:t>
+      </w:r>
+      <w:r>
+        <w:rPr>
+          <w:b/>
+          <w:bCs/>
+        </w:rPr>
+        <w:t xml:space="preserve">Next steps</w:t>
+      </w:r>
+      <w:r>
+        <w:t xml:space="preserve">. Copy and run those too, then </w:t>
+      </w:r>
+      <w:r>
+        <w:rPr>
+          <w:b/>
+          <w:bCs/>
+        </w:rPr>
+        <w:t xml:space="preserve">close Terminal and open a new one</w:t>
+      </w:r>
+      <w:r>
+        <w:t xml:space="preserve">.</w:t>
+      </w:r>
+    </w:p>
+    <w:p>
+      <w:pPr>
+        <w:spacing w:after="140" w:line="276" w:lineRule="auto"/>
+      </w:pPr>
+      <w:r>
+        <w:rPr>
+          <w:b/>
+          <w:bCs/>
+        </w:rPr>
+        <w:t xml:space="preserve">2. Node, Python and uv:</w:t>
       </w:r>
     </w:p>
     <w:p>
@@ -1361,7 +1395,7 @@
                 <w:sz w:val="18"/>
                 <w:szCs w:val="18"/>
               </w:rPr>
-              <w:t xml:space="preserve">/bin/bash -c "$(curl -fsSL https://raw.githubusercontent.com/Homebrew/install/HEAD/install.sh)"</w:t>
+              <w:t xml:space="preserve">brew install node python uv</w:t>
             </w:r>
           </w:p>
         </w:tc>
@@ -1377,39 +1411,11 @@
         <w:spacing w:after="140" w:line="276" w:lineRule="auto"/>
       </w:pPr>
       <w:r>
-        <w:t xml:space="preserve">When it finishes, it prints two or three lines under </w:t>
-      </w:r>
-      <w:r>
-        <w:rPr>
-          <w:b/>
-          <w:bCs/>
-        </w:rPr>
-        <w:t xml:space="preserve">Next steps</w:t>
-      </w:r>
-      <w:r>
-        <w:t xml:space="preserve">. Copy and run those too, then </w:t>
-      </w:r>
-      <w:r>
-        <w:rPr>
-          <w:b/>
-          <w:bCs/>
-        </w:rPr>
-        <w:t xml:space="preserve">close Terminal and open a new one</w:t>
-      </w:r>
-      <w:r>
-        <w:t xml:space="preserve">.</w:t>
-      </w:r>
-    </w:p>
-    <w:p>
-      <w:pPr>
-        <w:spacing w:after="140" w:line="276" w:lineRule="auto"/>
-      </w:pPr>
-      <w:r>
-        <w:rPr>
-          <w:b/>
-          <w:bCs/>
-        </w:rPr>
-        <w:t xml:space="preserve">3. Node, Python and uv:</w:t>
+        <w:rPr>
+          <w:b/>
+          <w:bCs/>
+        </w:rPr>
+        <w:t xml:space="preserve">3. Claude Code:</w:t>
       </w:r>
     </w:p>
     <w:p>
@@ -1473,7 +1479,7 @@
                 <w:sz w:val="18"/>
                 <w:szCs w:val="18"/>
               </w:rPr>
-              <w:t xml:space="preserve">brew install node python uv</w:t>
+              <w:t xml:space="preserve">curl -fsSL https://claude.ai/install.sh | bash</w:t>
             </w:r>
           </w:p>
         </w:tc>
@@ -1489,11 +1495,83 @@
         <w:spacing w:after="140" w:line="276" w:lineRule="auto"/>
       </w:pPr>
       <w:r>
-        <w:rPr>
-          <w:b/>
-          <w:bCs/>
-        </w:rPr>
-        <w:t xml:space="preserve">4. Claude Code:</w:t>
+        <w:t xml:space="preserve">Close Terminal and open a new one, then go to </w:t>
+      </w:r>
+      <w:r>
+        <w:rPr>
+          <w:b/>
+          <w:bCs/>
+        </w:rPr>
+        <w:t xml:space="preserve">Step 4</w:t>
+      </w:r>
+      <w:r>
+        <w:t xml:space="preserve">.</w:t>
+      </w:r>
+    </w:p>
+    <w:p>
+      <w:pPr>
+        <w:pStyle w:val="Heading2"/>
+        <w:spacing w:before="260" w:after="100"/>
+      </w:pPr>
+      <w:r>
+        <w:t xml:space="preserve">Step 3B · Windows setup (one command, about 30 minutes)</w:t>
+      </w:r>
+    </w:p>
+    <w:p>
+      <w:pPr>
+        <w:spacing w:after="140" w:line="276" w:lineRule="auto"/>
+      </w:pPr>
+      <w:r>
+        <w:t xml:space="preserve">A setup script does all of it for you. It turns on WSL (a Linux system that runs inside Windows), installs Ubuntu, installs every tool the course needs, then downloads the course app and checks it.</w:t>
+      </w:r>
+    </w:p>
+    <w:p>
+      <w:pPr>
+        <w:spacing w:after="140" w:line="276" w:lineRule="auto"/>
+      </w:pPr>
+      <w:r>
+        <w:rPr>
+          <w:b/>
+          <w:bCs/>
+        </w:rPr>
+        <w:t xml:space="preserve">1.</w:t>
+      </w:r>
+      <w:r>
+        <w:t xml:space="preserve"> Click Start, type </w:t>
+      </w:r>
+      <w:r>
+        <w:rPr>
+          <w:i/>
+        </w:rPr>
+        <w:t xml:space="preserve">PowerShell</w:t>
+      </w:r>
+      <w:r>
+        <w:t xml:space="preserve">, and open </w:t>
+      </w:r>
+      <w:r>
+        <w:rPr>
+          <w:b/>
+          <w:bCs/>
+        </w:rPr>
+        <w:t xml:space="preserve">Windows PowerShell</w:t>
+      </w:r>
+      <w:r>
+        <w:t xml:space="preserve">. You do not need Run as administrator.</w:t>
+      </w:r>
+    </w:p>
+    <w:p>
+      <w:pPr>
+        <w:spacing w:after="140" w:line="276" w:lineRule="auto"/>
+      </w:pPr>
+      <w:r>
+        <w:rPr>
+          <w:b/>
+          <w:bCs/>
+        </w:rPr>
+        <w:t xml:space="preserve">2.</w:t>
+      </w:r>
+      <w:r>
+        <w:t xml:space="preserve"> Paste this line and press Enter:</w:t>
       </w:r>
     </w:p>
     <w:p>
@@ -1512,7 +1590,7 @@
           <w:sz w:val="16"/>
           <w:szCs w:val="16"/>
         </w:rPr>
-        <w:t>Terminal</w:t>
+        <w:t>Windows PowerShell</w:t>
       </w:r>
     </w:p>
     <w:tbl>
@@ -1557,7 +1635,7 @@
                 <w:sz w:val="18"/>
                 <w:szCs w:val="18"/>
               </w:rPr>
-              <w:t xml:space="preserve">curl -fsSL https://claude.ai/install.sh | bash</w:t>
+              <w:t xml:space="preserve">irm https://raw.githubusercontent.com/paulkeen/tca-habits/main/scripts/install-windows.ps1 | iex</w:t>
             </w:r>
           </w:p>
         </w:tc>
@@ -1573,17 +1651,224 @@
         <w:spacing w:after="140" w:line="276" w:lineRule="auto"/>
       </w:pPr>
       <w:r>
-        <w:t xml:space="preserve">Close Terminal and open a new one, then go to </w:t>
-      </w:r>
-      <w:r>
-        <w:rPr>
-          <w:b/>
-          <w:bCs/>
-        </w:rPr>
-        <w:t xml:space="preserve">Step 4</w:t>
+        <w:rPr>
+          <w:b/>
+          <w:bCs/>
+        </w:rPr>
+        <w:t xml:space="preserve">3.</w:t>
+      </w:r>
+      <w:r>
+        <w:t xml:space="preserve"> Leave the window open. It may ask you to do three things:</w:t>
+      </w:r>
+    </w:p>
+    <w:p>
+      <w:pPr>
+        <w:pStyle w:val="ListBullet"/>
+        <w:spacing w:after="60" w:line="276" w:lineRule="auto"/>
+      </w:pPr>
+      <w:r>
+        <w:rPr>
+          <w:b/>
+          <w:bCs/>
+        </w:rPr>
+        <w:t xml:space="preserve">Do you want to allow this app to make changes?</w:t>
+      </w:r>
+      <w:r>
+        <w:t xml:space="preserve"> Click </w:t>
+      </w:r>
+      <w:r>
+        <w:rPr>
+          <w:b/>
+          <w:bCs/>
+        </w:rPr>
+        <w:t xml:space="preserve">Yes</w:t>
+      </w:r>
+      <w:r>
+        <w:t xml:space="preserve">. It asks once, to turn WSL on.</w:t>
+      </w:r>
+    </w:p>
+    <w:p>
+      <w:pPr>
+        <w:pStyle w:val="ListBullet"/>
+        <w:spacing w:after="60" w:line="276" w:lineRule="auto"/>
+      </w:pPr>
+      <w:r>
+        <w:rPr>
+          <w:b/>
+          <w:bCs/>
+        </w:rPr>
+        <w:t xml:space="preserve">RESTART YOUR COMPUTER.</w:t>
+      </w:r>
+      <w:r>
+        <w:t xml:space="preserve"> Restart, open PowerShell again, and paste the same line. It carries on from where it stopped.</w:t>
+      </w:r>
+    </w:p>
+    <w:p>
+      <w:pPr>
+        <w:pStyle w:val="ListBullet"/>
+        <w:spacing w:after="60" w:line="276" w:lineRule="auto"/>
+      </w:pPr>
+      <w:r>
+        <w:rPr>
+          <w:b/>
+          <w:bCs/>
+        </w:rPr>
+        <w:t xml:space="preserve">Choose an Ubuntu username and password.</w:t>
+      </w:r>
+      <w:r>
+        <w:t xml:space="preserve"> Use lowercase letters for the username. The password shows nothing as you type; that is normal. Write it down. When you see a prompt ending in </w:t>
+      </w:r>
+      <w:r>
+        <w:rPr>
+          <w:rFonts w:ascii="Consolas" w:hAnsi="Consolas" w:cs="Consolas"/>
+          <w:sz w:val="20"/>
+          <w:szCs w:val="20"/>
+        </w:rPr>
+        <w:t xml:space="preserve">$</w:t>
+      </w:r>
+      <w:r>
+        <w:t xml:space="preserve">, type </w:t>
+      </w:r>
+      <w:r>
+        <w:rPr>
+          <w:rFonts w:ascii="Consolas" w:hAnsi="Consolas" w:cs="Consolas"/>
+          <w:sz w:val="20"/>
+          <w:szCs w:val="20"/>
+        </w:rPr>
+        <w:t xml:space="preserve">exit</w:t>
+      </w:r>
+      <w:r>
+        <w:t xml:space="preserve"> and press Enter.</w:t>
+      </w:r>
+    </w:p>
+    <w:p>
+      <w:pPr>
+        <w:spacing w:after="140" w:line="276" w:lineRule="auto"/>
+      </w:pPr>
+      <w:r>
+        <w:t xml:space="preserve">It ends with a list of </w:t>
+      </w:r>
+      <w:r>
+        <w:rPr>
+          <w:b/>
+          <w:bCs/>
+        </w:rPr>
+        <w:t xml:space="preserve">PASS</w:t>
+      </w:r>
+      <w:r>
+        <w:t xml:space="preserve"> lines and </w:t>
+      </w:r>
+      <w:r>
+        <w:rPr>
+          <w:b/>
+          <w:bCs/>
+        </w:rPr>
+        <w:t xml:space="preserve">Setup finished.</w:t>
+      </w:r>
+      <w:r>
+        <w:t xml:space="preserve"> Skip Step 4 (the script has already checked everything) and go to </w:t>
+      </w:r>
+      <w:r>
+        <w:rPr>
+          <w:b/>
+          <w:bCs/>
+        </w:rPr>
+        <w:t xml:space="preserve">Step 5</w:t>
       </w:r>
       <w:r>
         <w:t xml:space="preserve">.</w:t>
+      </w:r>
+    </w:p>
+    <w:p>
+      <w:pPr>
+        <w:spacing w:after="140" w:line="276" w:lineRule="auto"/>
+      </w:pPr>
+      <w:r>
+        <w:rPr>
+          <w:b/>
+          <w:bCs/>
+        </w:rPr>
+        <w:t xml:space="preserve">Two Windows rules for the day:</w:t>
+      </w:r>
+    </w:p>
+    <w:p>
+      <w:pPr>
+        <w:pStyle w:val="ListBullet"/>
+        <w:spacing w:after="60" w:line="276" w:lineRule="auto"/>
+      </w:pPr>
+      <w:r>
+        <w:t xml:space="preserve">From now on, use the </w:t>
+      </w:r>
+      <w:r>
+        <w:rPr>
+          <w:b/>
+          <w:bCs/>
+        </w:rPr>
+        <w:t xml:space="preserve">Ubuntu</w:t>
+      </w:r>
+      <w:r>
+        <w:t xml:space="preserve"> app (Start menu, type </w:t>
+      </w:r>
+      <w:r>
+        <w:rPr>
+          <w:i/>
+        </w:rPr>
+        <w:t xml:space="preserve">Ubuntu</w:t>
+      </w:r>
+      <w:r>
+        <w:t xml:space="preserve">) for every command in the course, not PowerShell. Your work lives in its home folder (</w:t>
+      </w:r>
+      <w:r>
+        <w:rPr>
+          <w:rFonts w:ascii="Consolas" w:hAnsi="Consolas" w:cs="Consolas"/>
+          <w:sz w:val="20"/>
+          <w:szCs w:val="20"/>
+        </w:rPr>
+        <w:t xml:space="preserve">~</w:t>
+      </w:r>
+      <w:r>
+        <w:t xml:space="preserve">); </w:t>
+      </w:r>
+      <w:r>
+        <w:rPr>
+          <w:b/>
+          <w:bCs/>
+        </w:rPr>
+        <w:t xml:space="preserve">do not</w:t>
+      </w:r>
+      <w:r>
+        <w:t xml:space="preserve"> work in </w:t>
+      </w:r>
+      <w:r>
+        <w:rPr>
+          <w:rFonts w:ascii="Consolas" w:hAnsi="Consolas" w:cs="Consolas"/>
+          <w:sz w:val="20"/>
+          <w:szCs w:val="20"/>
+        </w:rPr>
+        <w:t xml:space="preserve">/mnt/c/...</w:t>
+      </w:r>
+      <w:r>
+        <w:t xml:space="preserve">, where everything runs much slower.</w:t>
+      </w:r>
+    </w:p>
+    <w:p>
+      <w:pPr>
+        <w:pStyle w:val="ListBullet"/>
+        <w:spacing w:after="60" w:line="276" w:lineRule="auto"/>
+      </w:pPr>
+      <w:r>
+        <w:t xml:space="preserve">Open the app in your normal Windows browser at </w:t>
+      </w:r>
+      <w:r>
+        <w:rPr>
+          <w:rFonts w:ascii="Consolas" w:hAnsi="Consolas" w:cs="Consolas"/>
+          <w:sz w:val="20"/>
+          <w:szCs w:val="20"/>
+        </w:rPr>
+        <w:t xml:space="preserve">http://localhost:5173</w:t>
+      </w:r>
+      <w:r>
+        <w:t xml:space="preserve">. It reaches Ubuntu automatically.</w:t>
       </w:r>
     </w:p>
     <w:p>
@@ -1592,7 +1877,7 @@
         <w:spacing w:before="260" w:after="100"/>
       </w:pPr>
       <w:r>
-        <w:t xml:space="preserve">Step 3B · Windows setup with WSL (20 minutes, plus a restart)</w:t>
+        <w:t xml:space="preserve">Step 3C · Linux setup (one command, about 15 minutes)</w:t>
       </w:r>
     </w:p>
     <w:p>
@@ -1600,43 +1885,7 @@
         <w:spacing w:after="140" w:line="276" w:lineRule="auto"/>
       </w:pPr>
       <w:r>
-        <w:rPr>
-          <w:b/>
-          <w:bCs/>
-        </w:rPr>
-        <w:t xml:space="preserve">1. Turn on WSL.</w:t>
-      </w:r>
-      <w:r>
-        <w:t xml:space="preserve"> Click Start, type </w:t>
-      </w:r>
-      <w:r>
-        <w:rPr>
-          <w:i/>
-        </w:rPr>
-        <w:t xml:space="preserve">PowerShell</w:t>
-      </w:r>
-      <w:r>
-        <w:t xml:space="preserve">, right-click </w:t>
-      </w:r>
-      <w:r>
-        <w:rPr>
-          <w:b/>
-          <w:bCs/>
-        </w:rPr>
-        <w:t xml:space="preserve">Windows PowerShell</w:t>
-      </w:r>
-      <w:r>
-        <w:t xml:space="preserve"> and choose </w:t>
-      </w:r>
-      <w:r>
-        <w:rPr>
-          <w:b/>
-          <w:bCs/>
-        </w:rPr>
-        <w:t xml:space="preserve">Run as administrator</w:t>
-      </w:r>
-      <w:r>
-        <w:t xml:space="preserve">. Then run:</w:t>
+        <w:t xml:space="preserve">On Ubuntu or Debian, open a terminal and run:</w:t>
       </w:r>
     </w:p>
     <w:p>
@@ -1655,7 +1904,7 @@
           <w:sz w:val="16"/>
           <w:szCs w:val="16"/>
         </w:rPr>
-        <w:t>PowerShell (as Administrator)</w:t>
+        <w:t>Terminal</w:t>
       </w:r>
     </w:p>
     <w:tbl>
@@ -1700,7 +1949,7 @@
                 <w:sz w:val="18"/>
                 <w:szCs w:val="18"/>
               </w:rPr>
-              <w:t xml:space="preserve">wsl --install -d Ubuntu</w:t>
+              <w:t xml:space="preserve">curl -fsSL https://raw.githubusercontent.com/paulkeen/tca-habits/main/scripts/install-ubuntu.sh | bash</w:t>
             </w:r>
           </w:p>
         </w:tc>
@@ -1716,33 +1965,58 @@
         <w:spacing w:after="140" w:line="276" w:lineRule="auto"/>
       </w:pPr>
       <w:r>
-        <w:rPr>
-          <w:b/>
-          <w:bCs/>
-        </w:rPr>
-        <w:t xml:space="preserve">Restart your computer</w:t>
-      </w:r>
-      <w:r>
-        <w:t xml:space="preserve"> when it asks. Afterwards an </w:t>
-      </w:r>
-      <w:r>
-        <w:rPr>
-          <w:b/>
-          <w:bCs/>
-        </w:rPr>
-        <w:t xml:space="preserve">Ubuntu</w:t>
-      </w:r>
-      <w:r>
-        <w:t xml:space="preserve"> window opens (or find </w:t>
-      </w:r>
-      <w:r>
-        <w:rPr>
-          <w:i/>
-        </w:rPr>
-        <w:t xml:space="preserve">Ubuntu</w:t>
-      </w:r>
-      <w:r>
-        <w:t xml:space="preserve"> in the Start menu). It asks you to choose a username and password. Write the password down: you will need it in a moment.</w:t>
+        <w:t xml:space="preserve">It asks for your password once (for the system packages), installs everything, downloads the course app and ends with a list of </w:t>
+      </w:r>
+      <w:r>
+        <w:rPr>
+          <w:b/>
+          <w:bCs/>
+        </w:rPr>
+        <w:t xml:space="preserve">PASS</w:t>
+      </w:r>
+      <w:r>
+        <w:t xml:space="preserve"> lines. Open a new terminal and go to </w:t>
+      </w:r>
+      <w:r>
+        <w:rPr>
+          <w:b/>
+          <w:bCs/>
+        </w:rPr>
+        <w:t xml:space="preserve">Step 5</w:t>
+      </w:r>
+      <w:r>
+        <w:t xml:space="preserve">. On another distribution, install </w:t>
+      </w:r>
+      <w:r>
+        <w:rPr>
+          <w:rFonts w:ascii="Consolas" w:hAnsi="Consolas" w:cs="Consolas"/>
+          <w:sz w:val="20"/>
+          <w:szCs w:val="20"/>
+        </w:rPr>
+        <w:t xml:space="preserve">make</w:t>
+      </w:r>
+      <w:r>
+        <w:t xml:space="preserve">, </w:t>
+      </w:r>
+      <w:r>
+        <w:rPr>
+          <w:rFonts w:ascii="Consolas" w:hAnsi="Consolas" w:cs="Consolas"/>
+          <w:sz w:val="20"/>
+          <w:szCs w:val="20"/>
+        </w:rPr>
+        <w:t xml:space="preserve">git</w:t>
+      </w:r>
+      <w:r>
+        <w:t xml:space="preserve">, Node 22, Python 3.11, uv and Claude Code yourself, then do Step 4.</w:t>
+      </w:r>
+    </w:p>
+    <w:p>
+      <w:pPr>
+        <w:pStyle w:val="Heading2"/>
+        <w:spacing w:before="260" w:after="100"/>
+      </w:pPr>
+      <w:r>
+        <w:t xml:space="preserve">Step 4 · Check everything installed (2 minutes)</w:t>
       </w:r>
     </w:p>
     <w:p>
@@ -1750,23 +2024,14 @@
         <w:spacing w:after="140" w:line="276" w:lineRule="auto"/>
       </w:pPr>
       <w:r>
-        <w:rPr>
-          <w:b/>
-          <w:bCs/>
-        </w:rPr>
-        <w:t xml:space="preserve">2. Inside Ubuntu</w:t>
-      </w:r>
-      <w:r>
-        <w:t xml:space="preserve">, run each box in turn. From here on, </w:t>
-      </w:r>
-      <w:r>
-        <w:rPr>
-          <w:i/>
-        </w:rPr>
-        <w:t xml:space="preserve">always use the Ubuntu window</w:t>
-      </w:r>
-      <w:r>
-        <w:t xml:space="preserve">, not PowerShell.</w:t>
+        <w:t xml:space="preserve">Mac and Codespaces only; on Windows and Linux the script did this for you. Run this. </w:t>
+      </w:r>
+      <w:r>
+        <w:rPr>
+          <w:b/>
+          <w:bCs/>
+        </w:rPr>
+        <w:t xml:space="preserve">Every line must print a version number, not an error.</w:t>
       </w:r>
     </w:p>
     <w:p>
@@ -1785,7 +2050,7 @@
           <w:sz w:val="16"/>
           <w:szCs w:val="16"/>
         </w:rPr>
-        <w:t>Ubuntu</w:t>
+        <w:t>Terminal</w:t>
       </w:r>
     </w:p>
     <w:tbl>
@@ -1830,7 +2095,7 @@
                 <w:sz w:val="18"/>
                 <w:szCs w:val="18"/>
               </w:rPr>
-              <w:t xml:space="preserve">sudo apt update &amp;&amp; sudo apt install -y make git curl unzip</w:t>
+              <w:t xml:space="preserve">claude --version</w:t>
             </w:r>
             <w:r>
               <w:rPr>
@@ -1839,7 +2104,43 @@
                 <w:szCs w:val="18"/>
               </w:rPr>
               <w:br/>
-              <w:t xml:space="preserve">git config --global core.autocrlf input</w:t>
+              <w:t xml:space="preserve">git --version</w:t>
+            </w:r>
+            <w:r>
+              <w:rPr>
+                <w:rFonts w:ascii="Consolas" w:hAnsi="Consolas" w:cs="Consolas"/>
+                <w:sz w:val="18"/>
+                <w:szCs w:val="18"/>
+              </w:rPr>
+              <w:br/>
+              <w:t xml:space="preserve">make --version | head -1</w:t>
+            </w:r>
+            <w:r>
+              <w:rPr>
+                <w:rFonts w:ascii="Consolas" w:hAnsi="Consolas" w:cs="Consolas"/>
+                <w:sz w:val="18"/>
+                <w:szCs w:val="18"/>
+              </w:rPr>
+              <w:br/>
+              <w:t xml:space="preserve">node --version      # must be v22 or higher</w:t>
+            </w:r>
+            <w:r>
+              <w:rPr>
+                <w:rFonts w:ascii="Consolas" w:hAnsi="Consolas" w:cs="Consolas"/>
+                <w:sz w:val="18"/>
+                <w:szCs w:val="18"/>
+              </w:rPr>
+              <w:br/>
+              <w:t xml:space="preserve">python3 --version   # must be 3.11 or higher</w:t>
+            </w:r>
+            <w:r>
+              <w:rPr>
+                <w:rFonts w:ascii="Consolas" w:hAnsi="Consolas" w:cs="Consolas"/>
+                <w:sz w:val="18"/>
+                <w:szCs w:val="18"/>
+              </w:rPr>
+              <w:br/>
+              <w:t xml:space="preserve">uv --version</w:t>
             </w:r>
           </w:p>
         </w:tc>
@@ -1855,30 +2156,7 @@
         <w:spacing w:after="140" w:line="276" w:lineRule="auto"/>
       </w:pPr>
       <w:r>
-        <w:rPr>
-          <w:rFonts w:ascii="Consolas" w:hAnsi="Consolas" w:cs="Consolas"/>
-          <w:sz w:val="20"/>
-          <w:szCs w:val="20"/>
-        </w:rPr>
-        <w:t xml:space="preserve">sudo</w:t>
-      </w:r>
-      <w:r>
-        <w:t xml:space="preserve"> asks for the Ubuntu password you just chose. Nothing appears on screen while you type it. That is normal.</w:t>
-      </w:r>
-    </w:p>
-    <w:p>
-      <w:pPr>
-        <w:spacing w:after="140" w:line="276" w:lineRule="auto"/>
-      </w:pPr>
-      <w:r>
-        <w:rPr>
-          <w:b/>
-          <w:bCs/>
-        </w:rPr>
-        <w:t xml:space="preserve">3. Node</w:t>
-      </w:r>
-      <w:r>
-        <w:t xml:space="preserve"> (via nvm, a Node version manager):</w:t>
+        <w:t xml:space="preserve">Optional, if you have a ChatGPT plan:</w:t>
       </w:r>
     </w:p>
     <w:p>
@@ -1897,7 +2175,7 @@
           <w:sz w:val="16"/>
           <w:szCs w:val="16"/>
         </w:rPr>
-        <w:t>Ubuntu</w:t>
+        <w:t>Terminal</w:t>
       </w:r>
     </w:p>
     <w:tbl>
@@ -1942,25 +2220,7 @@
                 <w:sz w:val="18"/>
                 <w:szCs w:val="18"/>
               </w:rPr>
-              <w:t xml:space="preserve">curl -o- https://raw.githubusercontent.com/nvm-sh/nvm/v0.40.3/install.sh | bash</w:t>
-            </w:r>
-            <w:r>
-              <w:rPr>
-                <w:rFonts w:ascii="Consolas" w:hAnsi="Consolas" w:cs="Consolas"/>
-                <w:sz w:val="18"/>
-                <w:szCs w:val="18"/>
-              </w:rPr>
-              <w:br/>
-              <w:t xml:space="preserve">source ~/.bashrc</w:t>
-            </w:r>
-            <w:r>
-              <w:rPr>
-                <w:rFonts w:ascii="Consolas" w:hAnsi="Consolas" w:cs="Consolas"/>
-                <w:sz w:val="18"/>
-                <w:szCs w:val="18"/>
-              </w:rPr>
-              <w:br/>
-              <w:t xml:space="preserve">nvm install 22</w:t>
+              <w:t xml:space="preserve">npm install -g @openai/codex &amp;&amp; codex --version</w:t>
             </w:r>
           </w:p>
         </w:tc>
@@ -1973,6 +2233,15 @@
     </w:p>
     <w:p>
       <w:pPr>
+        <w:pStyle w:val="Heading2"/>
+        <w:spacing w:before="260" w:after="100"/>
+      </w:pPr>
+      <w:r>
+        <w:t xml:space="preserve">Step 5 · Log in and save tokens (5 minutes)</w:t>
+      </w:r>
+    </w:p>
+    <w:p>
+      <w:pPr>
         <w:spacing w:after="140" w:line="276" w:lineRule="auto"/>
       </w:pPr>
       <w:r>
@@ -1980,7 +2249,7 @@
           <w:b/>
           <w:bCs/>
         </w:rPr>
-        <w:t xml:space="preserve">4. uv and Claude Code:</w:t>
+        <w:t xml:space="preserve">1. Log in to Claude Code:</w:t>
       </w:r>
     </w:p>
     <w:p>
@@ -1999,7 +2268,7 @@
           <w:sz w:val="16"/>
           <w:szCs w:val="16"/>
         </w:rPr>
-        <w:t>Ubuntu</w:t>
+        <w:t>Terminal</w:t>
       </w:r>
     </w:p>
     <w:tbl>
@@ -2044,16 +2313,7 @@
                 <w:sz w:val="18"/>
                 <w:szCs w:val="18"/>
               </w:rPr>
-              <w:t xml:space="preserve">curl -LsSf https://astral.sh/uv/install.sh | sh</w:t>
-            </w:r>
-            <w:r>
-              <w:rPr>
-                <w:rFonts w:ascii="Consolas" w:hAnsi="Consolas" w:cs="Consolas"/>
-                <w:sz w:val="18"/>
-                <w:szCs w:val="18"/>
-              </w:rPr>
-              <w:br/>
-              <w:t xml:space="preserve">curl -fsSL https://claude.ai/install.sh | bash</w:t>
+              <w:t xml:space="preserve">claude</w:t>
             </w:r>
           </w:p>
         </w:tc>
@@ -2069,17 +2329,17 @@
         <w:spacing w:after="140" w:line="276" w:lineRule="auto"/>
       </w:pPr>
       <w:r>
-        <w:t xml:space="preserve">Close the Ubuntu window, open a new one, then go to </w:t>
-      </w:r>
-      <w:r>
-        <w:rPr>
-          <w:b/>
-          <w:bCs/>
-        </w:rPr>
-        <w:t xml:space="preserve">Step 4</w:t>
-      </w:r>
-      <w:r>
-        <w:t xml:space="preserve">.</w:t>
+        <w:t xml:space="preserve">Follow the prompts. A browser opens; sign in with your Claude account. If no browser opens, press </w:t>
+      </w:r>
+      <w:r>
+        <w:rPr>
+          <w:b/>
+          <w:bCs/>
+        </w:rPr>
+        <w:t xml:space="preserve">c</w:t>
+      </w:r>
+      <w:r>
+        <w:t xml:space="preserve"> to copy the link and paste it into a browser yourself.</w:t>
       </w:r>
     </w:p>
     <w:p>
@@ -2091,92 +2351,10 @@
           <w:b/>
           <w:bCs/>
         </w:rPr>
-        <w:t xml:space="preserve">Two Windows rules for the day:</w:t>
-      </w:r>
-    </w:p>
-    <w:p>
-      <w:pPr>
-        <w:pStyle w:val="ListBullet"/>
-        <w:spacing w:after="60" w:line="276" w:lineRule="auto"/>
-      </w:pPr>
-      <w:r>
-        <w:t xml:space="preserve">Keep your work in the Ubuntu home folder (</w:t>
-      </w:r>
-      <w:r>
-        <w:rPr>
-          <w:rFonts w:ascii="Consolas" w:hAnsi="Consolas" w:cs="Consolas"/>
-          <w:sz w:val="20"/>
-          <w:szCs w:val="20"/>
-        </w:rPr>
-        <w:t xml:space="preserve">~</w:t>
-      </w:r>
-      <w:r>
-        <w:t xml:space="preserve">). </w:t>
-      </w:r>
-      <w:r>
-        <w:rPr>
-          <w:b/>
-          <w:bCs/>
-        </w:rPr>
-        <w:t xml:space="preserve">Do not</w:t>
-      </w:r>
-      <w:r>
-        <w:t xml:space="preserve"> work in </w:t>
-      </w:r>
-      <w:r>
-        <w:rPr>
-          <w:rFonts w:ascii="Consolas" w:hAnsi="Consolas" w:cs="Consolas"/>
-          <w:sz w:val="20"/>
-          <w:szCs w:val="20"/>
-        </w:rPr>
-        <w:t xml:space="preserve">/mnt/c/...</w:t>
-      </w:r>
-      <w:r>
-        <w:t xml:space="preserve">, where everything runs much slower.</w:t>
-      </w:r>
-    </w:p>
-    <w:p>
-      <w:pPr>
-        <w:pStyle w:val="ListBullet"/>
-        <w:spacing w:after="60" w:line="276" w:lineRule="auto"/>
-      </w:pPr>
-      <w:r>
-        <w:t xml:space="preserve">Open the app in your normal Windows browser at </w:t>
-      </w:r>
-      <w:r>
-        <w:rPr>
-          <w:rFonts w:ascii="Consolas" w:hAnsi="Consolas" w:cs="Consolas"/>
-          <w:sz w:val="20"/>
-          <w:szCs w:val="20"/>
-        </w:rPr>
-        <w:t xml:space="preserve">http://localhost:5173</w:t>
-      </w:r>
-      <w:r>
-        <w:t xml:space="preserve">. It reaches Ubuntu automatically.</w:t>
-      </w:r>
-    </w:p>
-    <w:p>
-      <w:pPr>
-        <w:pStyle w:val="Heading2"/>
-        <w:spacing w:before="260" w:after="100"/>
-      </w:pPr>
-      <w:r>
-        <w:t xml:space="preserve">Step 4 · Check everything installed (2 minutes)</w:t>
-      </w:r>
-    </w:p>
-    <w:p>
-      <w:pPr>
-        <w:spacing w:after="140" w:line="276" w:lineRule="auto"/>
-      </w:pPr>
-      <w:r>
-        <w:t xml:space="preserve">Run this. </w:t>
-      </w:r>
-      <w:r>
-        <w:rPr>
-          <w:b/>
-          <w:bCs/>
-        </w:rPr>
-        <w:t xml:space="preserve">Every line must print a version number, not an error.</w:t>
+        <w:t xml:space="preserve">2. Pick an economical default model.</w:t>
+      </w:r>
+      <w:r>
+        <w:t xml:space="preserve"> Inside Claude Code, type:</w:t>
       </w:r>
     </w:p>
     <w:p>
@@ -2195,7 +2373,7 @@
           <w:sz w:val="16"/>
           <w:szCs w:val="16"/>
         </w:rPr>
-        <w:t>Terminal</w:t>
+        <w:t>Inside Claude Code</w:t>
       </w:r>
     </w:p>
     <w:tbl>
@@ -2240,52 +2418,7 @@
                 <w:sz w:val="18"/>
                 <w:szCs w:val="18"/>
               </w:rPr>
-              <w:t xml:space="preserve">claude --version</w:t>
-            </w:r>
-            <w:r>
-              <w:rPr>
-                <w:rFonts w:ascii="Consolas" w:hAnsi="Consolas" w:cs="Consolas"/>
-                <w:sz w:val="18"/>
-                <w:szCs w:val="18"/>
-              </w:rPr>
-              <w:br/>
-              <w:t xml:space="preserve">git --version</w:t>
-            </w:r>
-            <w:r>
-              <w:rPr>
-                <w:rFonts w:ascii="Consolas" w:hAnsi="Consolas" w:cs="Consolas"/>
-                <w:sz w:val="18"/>
-                <w:szCs w:val="18"/>
-              </w:rPr>
-              <w:br/>
-              <w:t xml:space="preserve">make --version | head -1</w:t>
-            </w:r>
-            <w:r>
-              <w:rPr>
-                <w:rFonts w:ascii="Consolas" w:hAnsi="Consolas" w:cs="Consolas"/>
-                <w:sz w:val="18"/>
-                <w:szCs w:val="18"/>
-              </w:rPr>
-              <w:br/>
-              <w:t xml:space="preserve">node --version      # must be v22 or higher</w:t>
-            </w:r>
-            <w:r>
-              <w:rPr>
-                <w:rFonts w:ascii="Consolas" w:hAnsi="Consolas" w:cs="Consolas"/>
-                <w:sz w:val="18"/>
-                <w:szCs w:val="18"/>
-              </w:rPr>
-              <w:br/>
-              <w:t xml:space="preserve">python3 --version   # must be 3.11 or higher</w:t>
-            </w:r>
-            <w:r>
-              <w:rPr>
-                <w:rFonts w:ascii="Consolas" w:hAnsi="Consolas" w:cs="Consolas"/>
-                <w:sz w:val="18"/>
-                <w:szCs w:val="18"/>
-              </w:rPr>
-              <w:br/>
-              <w:t xml:space="preserve">uv --version</w:t>
+              <w:t xml:space="preserve">/model</w:t>
             </w:r>
           </w:p>
         </w:tc>
@@ -2301,14 +2434,32 @@
         <w:spacing w:after="140" w:line="276" w:lineRule="auto"/>
       </w:pPr>
       <w:r>
-        <w:rPr>
-          <w:b/>
-          <w:bCs/>
-        </w:rPr>
-        <w:t xml:space="preserve">Windows only.</w:t>
-      </w:r>
-      <w:r>
-        <w:t xml:space="preserve"> This line must show paths starting </w:t>
+        <w:t xml:space="preserve">Choose </w:t>
+      </w:r>
+      <w:r>
+        <w:rPr>
+          <w:b/>
+          <w:bCs/>
+        </w:rPr>
+        <w:t xml:space="preserve">Sonnet</w:t>
+      </w:r>
+      <w:r>
+        <w:t xml:space="preserve"> and press Enter. Claude Code remembers this for future sessions. Sonnet is fast and capable, and it makes your plan's usage last all day; the course shows you when a bigger model is worth it.</w:t>
+      </w:r>
+    </w:p>
+    <w:p>
+      <w:pPr>
+        <w:spacing w:after="140" w:line="276" w:lineRule="auto"/>
+      </w:pPr>
+      <w:r>
+        <w:rPr>
+          <w:b/>
+          <w:bCs/>
+        </w:rPr>
+        <w:t xml:space="preserve">3. Leave Claude Code:</w:t>
+      </w:r>
+      <w:r>
+        <w:t xml:space="preserve"> type </w:t>
       </w:r>
       <w:r>
         <w:rPr>
@@ -2316,31 +2467,42 @@
           <w:sz w:val="20"/>
           <w:szCs w:val="20"/>
         </w:rPr>
-        <w:t xml:space="preserve">/home/</w:t>
-      </w:r>
-      <w:r>
-        <w:t xml:space="preserve">, </w:t>
-      </w:r>
-      <w:r>
-        <w:rPr>
-          <w:b/>
-          <w:bCs/>
-        </w:rPr>
-        <w:t xml:space="preserve">not</w:t>
-      </w:r>
-      <w:r>
-        <w:t xml:space="preserve"> </w:t>
-      </w:r>
-      <w:r>
-        <w:rPr>
-          <w:rFonts w:ascii="Consolas" w:hAnsi="Consolas" w:cs="Consolas"/>
-          <w:sz w:val="20"/>
-          <w:szCs w:val="20"/>
-        </w:rPr>
-        <w:t xml:space="preserve">/mnt/c/</w:t>
-      </w:r>
-      <w:r>
-        <w:t xml:space="preserve">:</w:t>
+        <w:t xml:space="preserve">/exit</w:t>
+      </w:r>
+      <w:r>
+        <w:t xml:space="preserve">.</w:t>
+      </w:r>
+    </w:p>
+    <w:p>
+      <w:pPr>
+        <w:pStyle w:val="Heading2"/>
+        <w:spacing w:before="260" w:after="100"/>
+      </w:pPr>
+      <w:r>
+        <w:t xml:space="preserve">Step 6 · Run the course app once (10 minutes)</w:t>
+      </w:r>
+    </w:p>
+    <w:p>
+      <w:pPr>
+        <w:spacing w:after="140" w:line="276" w:lineRule="auto"/>
+      </w:pPr>
+      <w:r>
+        <w:t xml:space="preserve">This downloads the course's reference app, which is your safety net on the day, and proves everything works together.</w:t>
+      </w:r>
+    </w:p>
+    <w:p>
+      <w:pPr>
+        <w:spacing w:after="140" w:line="276" w:lineRule="auto"/>
+      </w:pPr>
+      <w:r>
+        <w:rPr>
+          <w:b/>
+          <w:bCs/>
+        </w:rPr>
+        <w:t xml:space="preserve">Mac and Codespaces</w:t>
+      </w:r>
+      <w:r>
+        <w:t xml:space="preserve"> (on Windows and Linux the script already did this box, so skip it):</w:t>
       </w:r>
     </w:p>
     <w:p>
@@ -2359,7 +2521,7 @@
           <w:sz w:val="16"/>
           <w:szCs w:val="16"/>
         </w:rPr>
-        <w:t>Ubuntu</w:t>
+        <w:t>Terminal</w:t>
       </w:r>
     </w:p>
     <w:tbl>
@@ -2404,7 +2566,34 @@
                 <w:sz w:val="18"/>
                 <w:szCs w:val="18"/>
               </w:rPr>
-              <w:t xml:space="preserve">which node claude</w:t>
+              <w:t xml:space="preserve">cd ~</w:t>
+            </w:r>
+            <w:r>
+              <w:rPr>
+                <w:rFonts w:ascii="Consolas" w:hAnsi="Consolas" w:cs="Consolas"/>
+                <w:sz w:val="18"/>
+                <w:szCs w:val="18"/>
+              </w:rPr>
+              <w:br/>
+              <w:t xml:space="preserve">git clone https://github.com/paulkeen/tca-habits.git tca-habits-reference</w:t>
+            </w:r>
+            <w:r>
+              <w:rPr>
+                <w:rFonts w:ascii="Consolas" w:hAnsi="Consolas" w:cs="Consolas"/>
+                <w:sz w:val="18"/>
+                <w:szCs w:val="18"/>
+              </w:rPr>
+              <w:br/>
+              <w:t xml:space="preserve">cd tca-habits-reference</w:t>
+            </w:r>
+            <w:r>
+              <w:rPr>
+                <w:rFonts w:ascii="Consolas" w:hAnsi="Consolas" w:cs="Consolas"/>
+                <w:sz w:val="18"/>
+                <w:szCs w:val="18"/>
+              </w:rPr>
+              <w:br/>
+              <w:t xml:space="preserve">./scripts/setup.sh</w:t>
             </w:r>
           </w:p>
         </w:tc>
@@ -2420,7 +2609,37 @@
         <w:spacing w:after="140" w:line="276" w:lineRule="auto"/>
       </w:pPr>
       <w:r>
-        <w:t xml:space="preserve">Optional, if you have a ChatGPT plan:</w:t>
+        <w:rPr>
+          <w:rFonts w:ascii="Consolas" w:hAnsi="Consolas" w:cs="Consolas"/>
+          <w:sz w:val="20"/>
+          <w:szCs w:val="20"/>
+        </w:rPr>
+        <w:t xml:space="preserve">setup.sh</w:t>
+      </w:r>
+      <w:r>
+        <w:t xml:space="preserve"> takes a minute or two and ends with </w:t>
+      </w:r>
+      <w:r>
+        <w:rPr>
+          <w:b/>
+          <w:bCs/>
+        </w:rPr>
+        <w:t xml:space="preserve">Setup complete.</w:t>
+      </w:r>
+    </w:p>
+    <w:p>
+      <w:pPr>
+        <w:spacing w:after="140" w:line="276" w:lineRule="auto"/>
+      </w:pPr>
+      <w:r>
+        <w:rPr>
+          <w:b/>
+          <w:bCs/>
+        </w:rPr>
+        <w:t xml:space="preserve">Everyone:</w:t>
+      </w:r>
+      <w:r>
+        <w:t xml:space="preserve"> run the automatic check, which prints a pass or fail line for every prerequisite and asks Claude one tiny question to prove your login works:</w:t>
       </w:r>
     </w:p>
     <w:p>
@@ -2484,7 +2703,16 @@
                 <w:sz w:val="18"/>
                 <w:szCs w:val="18"/>
               </w:rPr>
-              <w:t xml:space="preserve">npm install -g @openai/codex &amp;&amp; codex --version</w:t>
+              <w:t xml:space="preserve">cd ~/tca-habits-reference</w:t>
+            </w:r>
+            <w:r>
+              <w:rPr>
+                <w:rFonts w:ascii="Consolas" w:hAnsi="Consolas" w:cs="Consolas"/>
+                <w:sz w:val="18"/>
+                <w:szCs w:val="18"/>
+              </w:rPr>
+              <w:br/>
+              <w:t xml:space="preserve">./scripts/preflight.sh --agent</w:t>
             </w:r>
           </w:p>
         </w:tc>
@@ -2497,15 +2725,6 @@
     </w:p>
     <w:p>
       <w:pPr>
-        <w:pStyle w:val="Heading2"/>
-        <w:spacing w:before="260" w:after="100"/>
-      </w:pPr>
-      <w:r>
-        <w:t xml:space="preserve">Step 5 · Log in and save tokens (5 minutes)</w:t>
-      </w:r>
-    </w:p>
-    <w:p>
-      <w:pPr>
         <w:spacing w:after="140" w:line="276" w:lineRule="auto"/>
       </w:pPr>
       <w:r>
@@ -2513,7 +2732,10 @@
           <w:b/>
           <w:bCs/>
         </w:rPr>
-        <w:t xml:space="preserve">1. Log in to Claude Code:</w:t>
+        <w:t xml:space="preserve">Its output is what to paste into the WhatsApp group</w:t>
+      </w:r>
+      <w:r>
+        <w:t xml:space="preserve">, with ✅ if every line passes. Then start the app:</w:t>
       </w:r>
     </w:p>
     <w:p>
@@ -2577,7 +2799,7 @@
                 <w:sz w:val="18"/>
                 <w:szCs w:val="18"/>
               </w:rPr>
-              <w:t xml:space="preserve">claude</w:t>
+              <w:t xml:space="preserve">./scripts/dev.sh</w:t>
             </w:r>
           </w:p>
         </w:tc>
@@ -2593,17 +2815,27 @@
         <w:spacing w:after="140" w:line="276" w:lineRule="auto"/>
       </w:pPr>
       <w:r>
-        <w:t xml:space="preserve">Follow the prompts. A browser opens; sign in with your Claude account. If no browser opens, press </w:t>
-      </w:r>
-      <w:r>
-        <w:rPr>
-          <w:b/>
-          <w:bCs/>
-        </w:rPr>
-        <w:t xml:space="preserve">c</w:t>
-      </w:r>
-      <w:r>
-        <w:t xml:space="preserve"> to copy the link and paste it into a browser yourself.</w:t>
+        <w:t xml:space="preserve">Open </w:t>
+      </w:r>
+      <w:r>
+        <w:rPr>
+          <w:b/>
+          <w:bCs/>
+        </w:rPr>
+        <w:t xml:space="preserve">http://localhost:5173</w:t>
+      </w:r>
+      <w:r>
+        <w:t xml:space="preserve"> in your browser. You should see a grid of coloured habit tiles. Click one; it fills in. Back in the terminal, press </w:t>
+      </w:r>
+      <w:r>
+        <w:rPr>
+          <w:b/>
+          <w:bCs/>
+        </w:rPr>
+        <w:t xml:space="preserve">Ctrl+C</w:t>
+      </w:r>
+      <w:r>
+        <w:t xml:space="preserve"> to stop the app.</w:t>
       </w:r>
     </w:p>
     <w:p>
@@ -2615,10 +2847,7 @@
           <w:b/>
           <w:bCs/>
         </w:rPr>
-        <w:t xml:space="preserve">2. Pick an economical default model.</w:t>
-      </w:r>
-      <w:r>
-        <w:t xml:space="preserve"> Inside Claude Code, type:</w:t>
+        <w:t xml:space="preserve">Last check: does the agent work?</w:t>
       </w:r>
     </w:p>
     <w:p>
@@ -2637,7 +2866,7 @@
           <w:sz w:val="16"/>
           <w:szCs w:val="16"/>
         </w:rPr>
-        <w:t>Inside Claude Code</w:t>
+        <w:t>Terminal</w:t>
       </w:r>
     </w:p>
     <w:tbl>
@@ -2682,7 +2911,7 @@
                 <w:sz w:val="18"/>
                 <w:szCs w:val="18"/>
               </w:rPr>
-              <w:t xml:space="preserve">/model</w:t>
+              <w:t xml:space="preserve">claude</w:t>
             </w:r>
           </w:p>
         </w:tc>
@@ -2698,60 +2927,7 @@
         <w:spacing w:after="140" w:line="276" w:lineRule="auto"/>
       </w:pPr>
       <w:r>
-        <w:t xml:space="preserve">Choose </w:t>
-      </w:r>
-      <w:r>
-        <w:rPr>
-          <w:b/>
-          <w:bCs/>
-        </w:rPr>
-        <w:t xml:space="preserve">Sonnet</w:t>
-      </w:r>
-      <w:r>
-        <w:t xml:space="preserve"> and press Enter. Claude Code remembers this for future sessions. Sonnet is fast and capable, and it makes your plan's usage last all day; the course shows you when a bigger model is worth it.</w:t>
-      </w:r>
-    </w:p>
-    <w:p>
-      <w:pPr>
-        <w:spacing w:after="140" w:line="276" w:lineRule="auto"/>
-      </w:pPr>
-      <w:r>
-        <w:rPr>
-          <w:b/>
-          <w:bCs/>
-        </w:rPr>
-        <w:t xml:space="preserve">3. Leave Claude Code:</w:t>
-      </w:r>
-      <w:r>
-        <w:t xml:space="preserve"> type </w:t>
-      </w:r>
-      <w:r>
-        <w:rPr>
-          <w:rFonts w:ascii="Consolas" w:hAnsi="Consolas" w:cs="Consolas"/>
-          <w:sz w:val="20"/>
-          <w:szCs w:val="20"/>
-        </w:rPr>
-        <w:t xml:space="preserve">/exit</w:t>
-      </w:r>
-      <w:r>
-        <w:t xml:space="preserve">.</w:t>
-      </w:r>
-    </w:p>
-    <w:p>
-      <w:pPr>
-        <w:pStyle w:val="Heading2"/>
-        <w:spacing w:before="260" w:after="100"/>
-      </w:pPr>
-      <w:r>
-        <w:t xml:space="preserve">Step 6 · Run the course app once (10 minutes)</w:t>
-      </w:r>
-    </w:p>
-    <w:p>
-      <w:pPr>
-        <w:spacing w:after="140" w:line="276" w:lineRule="auto"/>
-      </w:pPr>
-      <w:r>
-        <w:t xml:space="preserve">This downloads the course's reference app, which is your safety net on the day, and proves everything works together.</w:t>
+        <w:t xml:space="preserve">Then type this and press Enter:</w:t>
       </w:r>
     </w:p>
     <w:p>
@@ -2770,7 +2946,7 @@
           <w:sz w:val="16"/>
           <w:szCs w:val="16"/>
         </w:rPr>
-        <w:t>Terminal</w:t>
+        <w:t>Inside Claude Code</w:t>
       </w:r>
     </w:p>
     <w:tbl>
@@ -2815,410 +2991,6 @@
                 <w:sz w:val="18"/>
                 <w:szCs w:val="18"/>
               </w:rPr>
-              <w:t xml:space="preserve">cd ~</w:t>
-            </w:r>
-            <w:r>
-              <w:rPr>
-                <w:rFonts w:ascii="Consolas" w:hAnsi="Consolas" w:cs="Consolas"/>
-                <w:sz w:val="18"/>
-                <w:szCs w:val="18"/>
-              </w:rPr>
-              <w:br/>
-              <w:t xml:space="preserve">git clone https://github.com/paulkeen/tca-habits.git tca-habits-reference</w:t>
-            </w:r>
-            <w:r>
-              <w:rPr>
-                <w:rFonts w:ascii="Consolas" w:hAnsi="Consolas" w:cs="Consolas"/>
-                <w:sz w:val="18"/>
-                <w:szCs w:val="18"/>
-              </w:rPr>
-              <w:br/>
-              <w:t xml:space="preserve">cd tca-habits-reference</w:t>
-            </w:r>
-            <w:r>
-              <w:rPr>
-                <w:rFonts w:ascii="Consolas" w:hAnsi="Consolas" w:cs="Consolas"/>
-                <w:sz w:val="18"/>
-                <w:szCs w:val="18"/>
-              </w:rPr>
-              <w:br/>
-              <w:t xml:space="preserve">./scripts/setup.sh</w:t>
-            </w:r>
-          </w:p>
-        </w:tc>
-      </w:tr>
-    </w:tbl>
-    <w:p>
-      <w:pPr>
-        <w:spacing w:after="120" w:line="120" w:lineRule="auto"/>
-      </w:pPr>
-    </w:p>
-    <w:p>
-      <w:pPr>
-        <w:spacing w:after="140" w:line="276" w:lineRule="auto"/>
-      </w:pPr>
-      <w:r>
-        <w:rPr>
-          <w:rFonts w:ascii="Consolas" w:hAnsi="Consolas" w:cs="Consolas"/>
-          <w:sz w:val="20"/>
-          <w:szCs w:val="20"/>
-        </w:rPr>
-        <w:t xml:space="preserve">setup.sh</w:t>
-      </w:r>
-      <w:r>
-        <w:t xml:space="preserve"> takes a minute or two and ends with </w:t>
-      </w:r>
-      <w:r>
-        <w:rPr>
-          <w:b/>
-          <w:bCs/>
-        </w:rPr>
-        <w:t xml:space="preserve">Setup complete.</w:t>
-      </w:r>
-      <w:r>
-        <w:t xml:space="preserve"> Now run the automatic check, which prints a pass or fail line for every prerequisite:</w:t>
-      </w:r>
-    </w:p>
-    <w:p>
-      <w:pPr>
-        <w:keepNext/>
-        <w:keepLines/>
-        <w:spacing w:before="160" w:after="20"/>
-      </w:pPr>
-      <w:r>
-        <w:rPr>
-          <w:b/>
-          <w:bCs/>
-          <w:caps/>
-          <w:color w:val="6E6E7A"/>
-          <w:spacing w:val="6"/>
-          <w:sz w:val="16"/>
-          <w:szCs w:val="16"/>
-        </w:rPr>
-        <w:t>Terminal</w:t>
-      </w:r>
-    </w:p>
-    <w:tbl>
-      <w:tblPr>
-        <w:tblStyle w:val="TableNormal0"/>
-        <w:tblW w:w="9360" w:type="dxa"/>
-        <w:tblInd w:w="0" w:type="dxa"/>
-        <w:tblBorders>
-          <w:top w:val="single" w:sz="4" w:space="0" w:color="E4E1EC"/>
-          <w:left w:val="single" w:sz="24" w:space="0" w:color="5E02D1"/>
-          <w:bottom w:val="single" w:sz="4" w:space="0" w:color="E4E1EC"/>
-          <w:right w:val="single" w:sz="4" w:space="0" w:color="E4E1EC"/>
-        </w:tblBorders>
-        <w:tblLayout w:type="fixed"/>
-        <w:tblCellMar>
-          <w:top w:w="140" w:type="dxa"/>
-          <w:left w:w="200" w:type="dxa"/>
-          <w:bottom w:w="140" w:type="dxa"/>
-          <w:right w:w="160" w:type="dxa"/>
-        </w:tblCellMar>
-        <w:tblLook w:val="04A0" w:firstRow="1" w:lastRow="0" w:firstColumn="1" w:lastColumn="0" w:noHBand="0" w:noVBand="1"/>
-      </w:tblPr>
-      <w:tblGrid>
-        <w:gridCol w:w="9360"/>
-      </w:tblGrid>
-      <w:tr>
-        <w:tc>
-          <w:tcPr>
-            <w:tcW w:w="9360" w:type="dxa"/>
-            <w:shd w:val="clear" w:color="auto" w:fill="F7F6FB"/>
-          </w:tcPr>
-          <w:p>
-            <w:pPr>
-              <w:keepNext/>
-              <w:keepLines/>
-              <w:spacing w:line="264" w:lineRule="auto"/>
-              <w:ind w:left="120"/>
-            </w:pPr>
-            <w:r>
-              <w:rPr>
-                <w:rFonts w:ascii="Consolas" w:hAnsi="Consolas" w:cs="Consolas"/>
-                <w:sz w:val="18"/>
-                <w:szCs w:val="18"/>
-              </w:rPr>
-              <w:t xml:space="preserve">./scripts/preflight.sh</w:t>
-            </w:r>
-          </w:p>
-        </w:tc>
-      </w:tr>
-    </w:tbl>
-    <w:p>
-      <w:pPr>
-        <w:spacing w:after="120" w:line="120" w:lineRule="auto"/>
-      </w:pPr>
-    </w:p>
-    <w:p>
-      <w:pPr>
-        <w:spacing w:after="140" w:line="276" w:lineRule="auto"/>
-      </w:pPr>
-      <w:r>
-        <w:rPr>
-          <w:b/>
-          <w:bCs/>
-        </w:rPr>
-        <w:t xml:space="preserve">Its output is what to paste into the WhatsApp group</w:t>
-      </w:r>
-      <w:r>
-        <w:t xml:space="preserve">, with ✅ if every line passes. Then start the app:</w:t>
-      </w:r>
-    </w:p>
-    <w:p>
-      <w:pPr>
-        <w:keepNext/>
-        <w:keepLines/>
-        <w:spacing w:before="160" w:after="20"/>
-      </w:pPr>
-      <w:r>
-        <w:rPr>
-          <w:b/>
-          <w:bCs/>
-          <w:caps/>
-          <w:color w:val="6E6E7A"/>
-          <w:spacing w:val="6"/>
-          <w:sz w:val="16"/>
-          <w:szCs w:val="16"/>
-        </w:rPr>
-        <w:t>Terminal</w:t>
-      </w:r>
-    </w:p>
-    <w:tbl>
-      <w:tblPr>
-        <w:tblStyle w:val="TableNormal0"/>
-        <w:tblW w:w="9360" w:type="dxa"/>
-        <w:tblInd w:w="0" w:type="dxa"/>
-        <w:tblBorders>
-          <w:top w:val="single" w:sz="4" w:space="0" w:color="E4E1EC"/>
-          <w:left w:val="single" w:sz="24" w:space="0" w:color="5E02D1"/>
-          <w:bottom w:val="single" w:sz="4" w:space="0" w:color="E4E1EC"/>
-          <w:right w:val="single" w:sz="4" w:space="0" w:color="E4E1EC"/>
-        </w:tblBorders>
-        <w:tblLayout w:type="fixed"/>
-        <w:tblCellMar>
-          <w:top w:w="140" w:type="dxa"/>
-          <w:left w:w="200" w:type="dxa"/>
-          <w:bottom w:w="140" w:type="dxa"/>
-          <w:right w:w="160" w:type="dxa"/>
-        </w:tblCellMar>
-        <w:tblLook w:val="04A0" w:firstRow="1" w:lastRow="0" w:firstColumn="1" w:lastColumn="0" w:noHBand="0" w:noVBand="1"/>
-      </w:tblPr>
-      <w:tblGrid>
-        <w:gridCol w:w="9360"/>
-      </w:tblGrid>
-      <w:tr>
-        <w:tc>
-          <w:tcPr>
-            <w:tcW w:w="9360" w:type="dxa"/>
-            <w:shd w:val="clear" w:color="auto" w:fill="F7F6FB"/>
-          </w:tcPr>
-          <w:p>
-            <w:pPr>
-              <w:keepNext/>
-              <w:keepLines/>
-              <w:spacing w:line="264" w:lineRule="auto"/>
-              <w:ind w:left="120"/>
-            </w:pPr>
-            <w:r>
-              <w:rPr>
-                <w:rFonts w:ascii="Consolas" w:hAnsi="Consolas" w:cs="Consolas"/>
-                <w:sz w:val="18"/>
-                <w:szCs w:val="18"/>
-              </w:rPr>
-              <w:t xml:space="preserve">./scripts/dev.sh</w:t>
-            </w:r>
-          </w:p>
-        </w:tc>
-      </w:tr>
-    </w:tbl>
-    <w:p>
-      <w:pPr>
-        <w:spacing w:after="120" w:line="120" w:lineRule="auto"/>
-      </w:pPr>
-    </w:p>
-    <w:p>
-      <w:pPr>
-        <w:spacing w:after="140" w:line="276" w:lineRule="auto"/>
-      </w:pPr>
-      <w:r>
-        <w:t xml:space="preserve">Open </w:t>
-      </w:r>
-      <w:r>
-        <w:rPr>
-          <w:b/>
-          <w:bCs/>
-        </w:rPr>
-        <w:t xml:space="preserve">http://localhost:5173</w:t>
-      </w:r>
-      <w:r>
-        <w:t xml:space="preserve"> in your browser. You should see a grid of coloured habit tiles. Click one; it fills in. Back in the terminal, press </w:t>
-      </w:r>
-      <w:r>
-        <w:rPr>
-          <w:b/>
-          <w:bCs/>
-        </w:rPr>
-        <w:t xml:space="preserve">Ctrl+C</w:t>
-      </w:r>
-      <w:r>
-        <w:t xml:space="preserve"> to stop the app.</w:t>
-      </w:r>
-    </w:p>
-    <w:p>
-      <w:pPr>
-        <w:spacing w:after="140" w:line="276" w:lineRule="auto"/>
-      </w:pPr>
-      <w:r>
-        <w:rPr>
-          <w:b/>
-          <w:bCs/>
-        </w:rPr>
-        <w:t xml:space="preserve">Last check: does the agent work?</w:t>
-      </w:r>
-    </w:p>
-    <w:p>
-      <w:pPr>
-        <w:keepNext/>
-        <w:keepLines/>
-        <w:spacing w:before="160" w:after="20"/>
-      </w:pPr>
-      <w:r>
-        <w:rPr>
-          <w:b/>
-          <w:bCs/>
-          <w:caps/>
-          <w:color w:val="6E6E7A"/>
-          <w:spacing w:val="6"/>
-          <w:sz w:val="16"/>
-          <w:szCs w:val="16"/>
-        </w:rPr>
-        <w:t>Terminal</w:t>
-      </w:r>
-    </w:p>
-    <w:tbl>
-      <w:tblPr>
-        <w:tblStyle w:val="TableNormal0"/>
-        <w:tblW w:w="9360" w:type="dxa"/>
-        <w:tblInd w:w="0" w:type="dxa"/>
-        <w:tblBorders>
-          <w:top w:val="single" w:sz="4" w:space="0" w:color="E4E1EC"/>
-          <w:left w:val="single" w:sz="24" w:space="0" w:color="5E02D1"/>
-          <w:bottom w:val="single" w:sz="4" w:space="0" w:color="E4E1EC"/>
-          <w:right w:val="single" w:sz="4" w:space="0" w:color="E4E1EC"/>
-        </w:tblBorders>
-        <w:tblLayout w:type="fixed"/>
-        <w:tblCellMar>
-          <w:top w:w="140" w:type="dxa"/>
-          <w:left w:w="200" w:type="dxa"/>
-          <w:bottom w:w="140" w:type="dxa"/>
-          <w:right w:w="160" w:type="dxa"/>
-        </w:tblCellMar>
-        <w:tblLook w:val="04A0" w:firstRow="1" w:lastRow="0" w:firstColumn="1" w:lastColumn="0" w:noHBand="0" w:noVBand="1"/>
-      </w:tblPr>
-      <w:tblGrid>
-        <w:gridCol w:w="9360"/>
-      </w:tblGrid>
-      <w:tr>
-        <w:tc>
-          <w:tcPr>
-            <w:tcW w:w="9360" w:type="dxa"/>
-            <w:shd w:val="clear" w:color="auto" w:fill="F7F6FB"/>
-          </w:tcPr>
-          <w:p>
-            <w:pPr>
-              <w:keepNext/>
-              <w:keepLines/>
-              <w:spacing w:line="264" w:lineRule="auto"/>
-              <w:ind w:left="120"/>
-            </w:pPr>
-            <w:r>
-              <w:rPr>
-                <w:rFonts w:ascii="Consolas" w:hAnsi="Consolas" w:cs="Consolas"/>
-                <w:sz w:val="18"/>
-                <w:szCs w:val="18"/>
-              </w:rPr>
-              <w:t xml:space="preserve">claude</w:t>
-            </w:r>
-          </w:p>
-        </w:tc>
-      </w:tr>
-    </w:tbl>
-    <w:p>
-      <w:pPr>
-        <w:spacing w:after="120" w:line="120" w:lineRule="auto"/>
-      </w:pPr>
-    </w:p>
-    <w:p>
-      <w:pPr>
-        <w:spacing w:after="140" w:line="276" w:lineRule="auto"/>
-      </w:pPr>
-      <w:r>
-        <w:t xml:space="preserve">Then type this and press Enter:</w:t>
-      </w:r>
-    </w:p>
-    <w:p>
-      <w:pPr>
-        <w:keepNext/>
-        <w:keepLines/>
-        <w:spacing w:before="160" w:after="20"/>
-      </w:pPr>
-      <w:r>
-        <w:rPr>
-          <w:b/>
-          <w:bCs/>
-          <w:caps/>
-          <w:color w:val="6E6E7A"/>
-          <w:spacing w:val="6"/>
-          <w:sz w:val="16"/>
-          <w:szCs w:val="16"/>
-        </w:rPr>
-        <w:t>Inside Claude Code</w:t>
-      </w:r>
-    </w:p>
-    <w:tbl>
-      <w:tblPr>
-        <w:tblStyle w:val="TableNormal0"/>
-        <w:tblW w:w="9360" w:type="dxa"/>
-        <w:tblInd w:w="0" w:type="dxa"/>
-        <w:tblBorders>
-          <w:top w:val="single" w:sz="4" w:space="0" w:color="E4E1EC"/>
-          <w:left w:val="single" w:sz="24" w:space="0" w:color="5E02D1"/>
-          <w:bottom w:val="single" w:sz="4" w:space="0" w:color="E4E1EC"/>
-          <w:right w:val="single" w:sz="4" w:space="0" w:color="E4E1EC"/>
-        </w:tblBorders>
-        <w:tblLayout w:type="fixed"/>
-        <w:tblCellMar>
-          <w:top w:w="140" w:type="dxa"/>
-          <w:left w:w="200" w:type="dxa"/>
-          <w:bottom w:w="140" w:type="dxa"/>
-          <w:right w:w="160" w:type="dxa"/>
-        </w:tblCellMar>
-        <w:tblLook w:val="04A0" w:firstRow="1" w:lastRow="0" w:firstColumn="1" w:lastColumn="0" w:noHBand="0" w:noVBand="1"/>
-      </w:tblPr>
-      <w:tblGrid>
-        <w:gridCol w:w="9360"/>
-      </w:tblGrid>
-      <w:tr>
-        <w:tc>
-          <w:tcPr>
-            <w:tcW w:w="9360" w:type="dxa"/>
-            <w:shd w:val="clear" w:color="auto" w:fill="F7F6FB"/>
-          </w:tcPr>
-          <w:p>
-            <w:pPr>
-              <w:keepNext/>
-              <w:keepLines/>
-              <w:spacing w:line="264" w:lineRule="auto"/>
-              <w:ind w:left="120"/>
-            </w:pPr>
-            <w:r>
-              <w:rPr>
-                <w:rFonts w:ascii="Consolas" w:hAnsi="Consolas" w:cs="Consolas"/>
-                <w:sz w:val="18"/>
-                <w:szCs w:val="18"/>
-              </w:rPr>
               <w:t xml:space="preserve">In two sentences: what does this project do, and how do I run its tests?</w:t>
             </w:r>
           </w:p>
@@ -3534,29 +3306,14 @@
                 <w:sz w:val="18"/>
                 <w:szCs w:val="18"/>
               </w:rPr>
-              <w:t xml:space="preserve">Windows:</w:t>
-            </w:r>
-            <w:r>
-              <w:rPr>
-                <w:sz w:val="18"/>
-                <w:szCs w:val="18"/>
-              </w:rPr>
-              <w:t xml:space="preserve"> </w:t>
-            </w:r>
-            <w:r>
-              <w:rPr>
-                <w:rFonts w:ascii="Consolas" w:hAnsi="Consolas" w:cs="Consolas"/>
-                <w:sz w:val="18"/>
-                <w:szCs w:val="18"/>
-              </w:rPr>
-              <w:t xml:space="preserve">nvm install 22</w:t>
-            </w:r>
-            <w:r>
-              <w:rPr>
-                <w:sz w:val="18"/>
-                <w:szCs w:val="18"/>
-              </w:rPr>
-              <w:t xml:space="preserve"> in Ubuntu.</w:t>
+              <w:t xml:space="preserve">Windows and Linux:</w:t>
+            </w:r>
+            <w:r>
+              <w:rPr>
+                <w:sz w:val="18"/>
+                <w:szCs w:val="18"/>
+              </w:rPr>
+              <w:t xml:space="preserve"> run the setup command again.</w:t>
             </w:r>
           </w:p>
         </w:tc>
@@ -3580,22 +3337,7 @@
                 <w:sz w:val="18"/>
                 <w:szCs w:val="18"/>
               </w:rPr>
-              <w:t xml:space="preserve">which node</w:t>
-            </w:r>
-            <w:r>
-              <w:rPr>
-                <w:sz w:val="18"/>
-                <w:szCs w:val="18"/>
-              </w:rPr>
-              <w:t xml:space="preserve"> shows </w:t>
-            </w:r>
-            <w:r>
-              <w:rPr>
-                <w:rFonts w:ascii="Consolas" w:hAnsi="Consolas" w:cs="Consolas"/>
-                <w:sz w:val="18"/>
-                <w:szCs w:val="18"/>
-              </w:rPr>
-              <w:t xml:space="preserve">/mnt/c/...</w:t>
+              <w:t xml:space="preserve">irm is not recognized</w:t>
             </w:r>
             <w:r>
               <w:rPr>
@@ -3620,7 +3362,23 @@
                 <w:sz w:val="18"/>
                 <w:szCs w:val="18"/>
               </w:rPr>
-              <w:t xml:space="preserve">Ubuntu is finding the Windows copy of Node. Rerun the Node steps in 3B, then open a new Ubuntu window.</w:t>
+              <w:t xml:space="preserve">You are in Command Prompt, not PowerShell. Open </w:t>
+            </w:r>
+            <w:r>
+              <w:rPr>
+                <w:b/>
+                <w:bCs/>
+                <w:sz w:val="18"/>
+                <w:szCs w:val="18"/>
+              </w:rPr>
+              <w:t xml:space="preserve">Windows PowerShell</w:t>
+            </w:r>
+            <w:r>
+              <w:rPr>
+                <w:sz w:val="18"/>
+                <w:szCs w:val="18"/>
+              </w:rPr>
+              <w:t xml:space="preserve"> and paste the line again.</w:t>
             </w:r>
           </w:p>
         </w:tc>
@@ -3640,11 +3398,34 @@
             </w:pPr>
             <w:r>
               <w:rPr>
+                <w:sz w:val="18"/>
+                <w:szCs w:val="18"/>
+              </w:rPr>
+              <w:t xml:space="preserve">The Windows script mentions </w:t>
+            </w:r>
+            <w:r>
+              <w:rPr>
+                <w:b/>
+                <w:bCs/>
+                <w:sz w:val="18"/>
+                <w:szCs w:val="18"/>
+              </w:rPr>
+              <w:t xml:space="preserve">virtualization</w:t>
+            </w:r>
+            <w:r>
+              <w:rPr>
+                <w:sz w:val="18"/>
+                <w:szCs w:val="18"/>
+              </w:rPr>
+              <w:t xml:space="preserve"> or error </w:t>
+            </w:r>
+            <w:r>
+              <w:rPr>
                 <w:rFonts w:ascii="Consolas" w:hAnsi="Consolas" w:cs="Consolas"/>
                 <w:sz w:val="18"/>
                 <w:szCs w:val="18"/>
               </w:rPr>
-              <w:t xml:space="preserve">./scripts/setup.sh: Permission denied</w:t>
+              <w:t xml:space="preserve">0x80370102</w:t>
             </w:r>
           </w:p>
         </w:tc>
@@ -3662,22 +3443,23 @@
                 <w:sz w:val="18"/>
                 <w:szCs w:val="18"/>
               </w:rPr>
-              <w:t xml:space="preserve">Run </w:t>
-            </w:r>
-            <w:r>
-              <w:rPr>
-                <w:rFonts w:ascii="Consolas" w:hAnsi="Consolas" w:cs="Consolas"/>
-                <w:sz w:val="18"/>
-                <w:szCs w:val="18"/>
-              </w:rPr>
-              <w:t xml:space="preserve">bash scripts/setup.sh</w:t>
-            </w:r>
-            <w:r>
-              <w:rPr>
-                <w:sz w:val="18"/>
-                <w:szCs w:val="18"/>
-              </w:rPr>
-              <w:t xml:space="preserve"> instead.</w:t>
+              <w:t xml:space="preserve">Virtualization is switched off in your PC's firmware settings. Post in the WhatsApp group; on a work laptop, use the </w:t>
+            </w:r>
+            <w:r>
+              <w:rPr>
+                <w:b/>
+                <w:bCs/>
+                <w:sz w:val="18"/>
+                <w:szCs w:val="18"/>
+              </w:rPr>
+              <w:t xml:space="preserve">Codespaces Setup</w:t>
+            </w:r>
+            <w:r>
+              <w:rPr>
+                <w:sz w:val="18"/>
+                <w:szCs w:val="18"/>
+              </w:rPr>
+              <w:t xml:space="preserve"> guide instead.</w:t>
             </w:r>
           </w:p>
         </w:tc>
@@ -3697,18 +3479,25 @@
             </w:pPr>
             <w:r>
               <w:rPr>
+                <w:sz w:val="18"/>
+                <w:szCs w:val="18"/>
+              </w:rPr>
+              <w:t xml:space="preserve">Preflight says WSL is using the Windows copy of a tool (</w:t>
+            </w:r>
+            <w:r>
+              <w:rPr>
                 <w:rFonts w:ascii="Consolas" w:hAnsi="Consolas" w:cs="Consolas"/>
                 <w:sz w:val="18"/>
                 <w:szCs w:val="18"/>
               </w:rPr>
-              <w:t xml:space="preserve">bash\r: No such file or directory</w:t>
-            </w:r>
-            <w:r>
-              <w:rPr>
-                <w:sz w:val="18"/>
-                <w:szCs w:val="18"/>
-              </w:rPr>
-              <w:t xml:space="preserve"> (Windows)</w:t>
+              <w:t xml:space="preserve">/mnt/c/...</w:t>
+            </w:r>
+            <w:r>
+              <w:rPr>
+                <w:sz w:val="18"/>
+                <w:szCs w:val="18"/>
+              </w:rPr>
+              <w:t xml:space="preserve">)</w:t>
             </w:r>
           </w:p>
         </w:tc>
@@ -3726,38 +3515,7 @@
                 <w:sz w:val="18"/>
                 <w:szCs w:val="18"/>
               </w:rPr>
-              <w:t xml:space="preserve">The repo was cloned with Windows line endings. Run </w:t>
-            </w:r>
-            <w:r>
-              <w:rPr>
-                <w:rFonts w:ascii="Consolas" w:hAnsi="Consolas" w:cs="Consolas"/>
-                <w:sz w:val="18"/>
-                <w:szCs w:val="18"/>
-              </w:rPr>
-              <w:t xml:space="preserve">git config --global core.autocrlf input</w:t>
-            </w:r>
-            <w:r>
-              <w:rPr>
-                <w:sz w:val="18"/>
-                <w:szCs w:val="18"/>
-              </w:rPr>
-              <w:t xml:space="preserve">, delete the folder, and clone again </w:t>
-            </w:r>
-            <w:r>
-              <w:rPr>
-                <w:b/>
-                <w:bCs/>
-                <w:sz w:val="18"/>
-                <w:szCs w:val="18"/>
-              </w:rPr>
-              <w:t xml:space="preserve">inside Ubuntu</w:t>
-            </w:r>
-            <w:r>
-              <w:rPr>
-                <w:sz w:val="18"/>
-                <w:szCs w:val="18"/>
-              </w:rPr>
-              <w:t xml:space="preserve">.</w:t>
+              <w:t xml:space="preserve">Paste the Windows setup line into PowerShell again; it installs the Linux copy. Then open a new Ubuntu window.</w:t>
             </w:r>
           </w:p>
         </w:tc>
@@ -3777,10 +3535,18 @@
             </w:pPr>
             <w:r>
               <w:rPr>
-                <w:sz w:val="18"/>
-                <w:szCs w:val="18"/>
-              </w:rPr>
-              <w:t xml:space="preserve">Port 5173 or 8000 "already in use"</w:t>
+                <w:rFonts w:ascii="Consolas" w:hAnsi="Consolas" w:cs="Consolas"/>
+                <w:sz w:val="18"/>
+                <w:szCs w:val="18"/>
+              </w:rPr>
+              <w:t xml:space="preserve">xcrun: error: invalid active developer path</w:t>
+            </w:r>
+            <w:r>
+              <w:rPr>
+                <w:sz w:val="18"/>
+                <w:szCs w:val="18"/>
+              </w:rPr>
+              <w:t xml:space="preserve"> (Mac)</w:t>
             </w:r>
           </w:p>
         </w:tc>
@@ -3798,7 +3564,7 @@
                 <w:sz w:val="18"/>
                 <w:szCs w:val="18"/>
               </w:rPr>
-              <w:t xml:space="preserve">An earlier </w:t>
+              <w:t xml:space="preserve">Usually after a macOS update. Run </w:t>
             </w:r>
             <w:r>
               <w:rPr>
@@ -3806,14 +3572,14 @@
                 <w:sz w:val="18"/>
                 <w:szCs w:val="18"/>
               </w:rPr>
-              <w:t xml:space="preserve">dev.sh</w:t>
-            </w:r>
-            <w:r>
-              <w:rPr>
-                <w:sz w:val="18"/>
-                <w:szCs w:val="18"/>
-              </w:rPr>
-              <w:t xml:space="preserve"> is still running in another terminal. Close it, or restart the terminal.</w:t>
+              <w:t xml:space="preserve">xcode-select --install</w:t>
+            </w:r>
+            <w:r>
+              <w:rPr>
+                <w:sz w:val="18"/>
+                <w:szCs w:val="18"/>
+              </w:rPr>
+              <w:t xml:space="preserve">, click Install, then open a new Terminal.</w:t>
             </w:r>
           </w:p>
         </w:tc>
@@ -3833,10 +3599,11 @@
             </w:pPr>
             <w:r>
               <w:rPr>
-                <w:sz w:val="18"/>
-                <w:szCs w:val="18"/>
-              </w:rPr>
-              <w:t xml:space="preserve">The browser login never finishes</w:t>
+                <w:rFonts w:ascii="Consolas" w:hAnsi="Consolas" w:cs="Consolas"/>
+                <w:sz w:val="18"/>
+                <w:szCs w:val="18"/>
+              </w:rPr>
+              <w:t xml:space="preserve">./scripts/setup.sh: Permission denied</w:t>
             </w:r>
           </w:p>
         </w:tc>
@@ -3854,23 +3621,22 @@
                 <w:sz w:val="18"/>
                 <w:szCs w:val="18"/>
               </w:rPr>
-              <w:t xml:space="preserve">Press </w:t>
-            </w:r>
-            <w:r>
-              <w:rPr>
-                <w:b/>
-                <w:bCs/>
-                <w:sz w:val="18"/>
-                <w:szCs w:val="18"/>
-              </w:rPr>
-              <w:t xml:space="preserve">c</w:t>
-            </w:r>
-            <w:r>
-              <w:rPr>
-                <w:sz w:val="18"/>
-                <w:szCs w:val="18"/>
-              </w:rPr>
-              <w:t xml:space="preserve"> in Claude Code to copy the link, open it yourself, then paste the code it shows you back into the terminal.</w:t>
+              <w:t xml:space="preserve">Run </w:t>
+            </w:r>
+            <w:r>
+              <w:rPr>
+                <w:rFonts w:ascii="Consolas" w:hAnsi="Consolas" w:cs="Consolas"/>
+                <w:sz w:val="18"/>
+                <w:szCs w:val="18"/>
+              </w:rPr>
+              <w:t xml:space="preserve">bash scripts/setup.sh</w:t>
+            </w:r>
+            <w:r>
+              <w:rPr>
+                <w:sz w:val="18"/>
+                <w:szCs w:val="18"/>
+              </w:rPr>
+              <w:t xml:space="preserve"> instead.</w:t>
             </w:r>
           </w:p>
         </w:tc>
@@ -3890,10 +3656,18 @@
             </w:pPr>
             <w:r>
               <w:rPr>
-                <w:sz w:val="18"/>
-                <w:szCs w:val="18"/>
-              </w:rPr>
-              <w:t xml:space="preserve">A preflight line says FAIL</w:t>
+                <w:rFonts w:ascii="Consolas" w:hAnsi="Consolas" w:cs="Consolas"/>
+                <w:sz w:val="18"/>
+                <w:szCs w:val="18"/>
+              </w:rPr>
+              <w:t xml:space="preserve">bash\r: No such file or directory</w:t>
+            </w:r>
+            <w:r>
+              <w:rPr>
+                <w:sz w:val="18"/>
+                <w:szCs w:val="18"/>
+              </w:rPr>
+              <w:t xml:space="preserve"> (Windows)</w:t>
             </w:r>
           </w:p>
         </w:tc>
@@ -3911,7 +3685,38 @@
                 <w:sz w:val="18"/>
                 <w:szCs w:val="18"/>
               </w:rPr>
-              <w:t xml:space="preserve">It names what is missing. Go back to that step; if it still fails, post the output.</w:t>
+              <w:t xml:space="preserve">The repo was cloned with Windows line endings. Run </w:t>
+            </w:r>
+            <w:r>
+              <w:rPr>
+                <w:rFonts w:ascii="Consolas" w:hAnsi="Consolas" w:cs="Consolas"/>
+                <w:sz w:val="18"/>
+                <w:szCs w:val="18"/>
+              </w:rPr>
+              <w:t xml:space="preserve">git config --global core.autocrlf input</w:t>
+            </w:r>
+            <w:r>
+              <w:rPr>
+                <w:sz w:val="18"/>
+                <w:szCs w:val="18"/>
+              </w:rPr>
+              <w:t xml:space="preserve">, delete the folder, and clone again </w:t>
+            </w:r>
+            <w:r>
+              <w:rPr>
+                <w:b/>
+                <w:bCs/>
+                <w:sz w:val="18"/>
+                <w:szCs w:val="18"/>
+              </w:rPr>
+              <w:t xml:space="preserve">inside Ubuntu</w:t>
+            </w:r>
+            <w:r>
+              <w:rPr>
+                <w:sz w:val="18"/>
+                <w:szCs w:val="18"/>
+              </w:rPr>
+              <w:t xml:space="preserve">.</w:t>
             </w:r>
           </w:p>
         </w:tc>
@@ -3934,7 +3739,7 @@
                 <w:sz w:val="18"/>
                 <w:szCs w:val="18"/>
               </w:rPr>
-              <w:t xml:space="preserve">Anything else</w:t>
+              <w:t xml:space="preserve">Port 5173 or 8000 "already in use"</w:t>
             </w:r>
           </w:p>
         </w:tc>
@@ -3942,6 +3747,160 @@
           <w:tcPr>
             <w:tcW w:w="5560" w:type="dxa"/>
             <w:shd w:val="clear" w:color="auto" w:fill="FFFFFF"/>
+          </w:tcPr>
+          <w:p>
+            <w:pPr>
+              <w:spacing w:before="40" w:after="40" w:line="252" w:lineRule="auto"/>
+            </w:pPr>
+            <w:r>
+              <w:rPr>
+                <w:sz w:val="18"/>
+                <w:szCs w:val="18"/>
+              </w:rPr>
+              <w:t xml:space="preserve">An earlier </w:t>
+            </w:r>
+            <w:r>
+              <w:rPr>
+                <w:rFonts w:ascii="Consolas" w:hAnsi="Consolas" w:cs="Consolas"/>
+                <w:sz w:val="18"/>
+                <w:szCs w:val="18"/>
+              </w:rPr>
+              <w:t xml:space="preserve">dev.sh</w:t>
+            </w:r>
+            <w:r>
+              <w:rPr>
+                <w:sz w:val="18"/>
+                <w:szCs w:val="18"/>
+              </w:rPr>
+              <w:t xml:space="preserve"> is still running in another terminal. Close it, or restart the terminal.</w:t>
+            </w:r>
+          </w:p>
+        </w:tc>
+      </w:tr>
+      <w:tr>
+        <w:trPr>
+          <w:cantSplit/>
+        </w:trPr>
+        <w:tc>
+          <w:tcPr>
+            <w:tcW w:w="3800" w:type="dxa"/>
+            <w:shd w:val="clear" w:color="auto" w:fill="F5F0FF"/>
+          </w:tcPr>
+          <w:p>
+            <w:pPr>
+              <w:spacing w:before="40" w:after="40" w:line="252" w:lineRule="auto"/>
+            </w:pPr>
+            <w:r>
+              <w:rPr>
+                <w:sz w:val="18"/>
+                <w:szCs w:val="18"/>
+              </w:rPr>
+              <w:t xml:space="preserve">The browser login never finishes</w:t>
+            </w:r>
+          </w:p>
+        </w:tc>
+        <w:tc>
+          <w:tcPr>
+            <w:tcW w:w="5560" w:type="dxa"/>
+            <w:shd w:val="clear" w:color="auto" w:fill="F5F0FF"/>
+          </w:tcPr>
+          <w:p>
+            <w:pPr>
+              <w:spacing w:before="40" w:after="40" w:line="252" w:lineRule="auto"/>
+            </w:pPr>
+            <w:r>
+              <w:rPr>
+                <w:sz w:val="18"/>
+                <w:szCs w:val="18"/>
+              </w:rPr>
+              <w:t xml:space="preserve">Press </w:t>
+            </w:r>
+            <w:r>
+              <w:rPr>
+                <w:b/>
+                <w:bCs/>
+                <w:sz w:val="18"/>
+                <w:szCs w:val="18"/>
+              </w:rPr>
+              <w:t xml:space="preserve">c</w:t>
+            </w:r>
+            <w:r>
+              <w:rPr>
+                <w:sz w:val="18"/>
+                <w:szCs w:val="18"/>
+              </w:rPr>
+              <w:t xml:space="preserve"> in Claude Code to copy the link, open it yourself, then paste the code it shows you back into the terminal.</w:t>
+            </w:r>
+          </w:p>
+        </w:tc>
+      </w:tr>
+      <w:tr>
+        <w:trPr>
+          <w:cantSplit/>
+        </w:trPr>
+        <w:tc>
+          <w:tcPr>
+            <w:tcW w:w="3800" w:type="dxa"/>
+            <w:shd w:val="clear" w:color="auto" w:fill="FFFFFF"/>
+          </w:tcPr>
+          <w:p>
+            <w:pPr>
+              <w:spacing w:before="40" w:after="40" w:line="252" w:lineRule="auto"/>
+            </w:pPr>
+            <w:r>
+              <w:rPr>
+                <w:sz w:val="18"/>
+                <w:szCs w:val="18"/>
+              </w:rPr>
+              <w:t xml:space="preserve">A preflight line says FAIL</w:t>
+            </w:r>
+          </w:p>
+        </w:tc>
+        <w:tc>
+          <w:tcPr>
+            <w:tcW w:w="5560" w:type="dxa"/>
+            <w:shd w:val="clear" w:color="auto" w:fill="FFFFFF"/>
+          </w:tcPr>
+          <w:p>
+            <w:pPr>
+              <w:spacing w:before="40" w:after="40" w:line="252" w:lineRule="auto"/>
+            </w:pPr>
+            <w:r>
+              <w:rPr>
+                <w:sz w:val="18"/>
+                <w:szCs w:val="18"/>
+              </w:rPr>
+              <w:t xml:space="preserve">It names what is missing. Go back to that step; if it still fails, post the output.</w:t>
+            </w:r>
+          </w:p>
+        </w:tc>
+      </w:tr>
+      <w:tr>
+        <w:trPr>
+          <w:cantSplit/>
+        </w:trPr>
+        <w:tc>
+          <w:tcPr>
+            <w:tcW w:w="3800" w:type="dxa"/>
+            <w:shd w:val="clear" w:color="auto" w:fill="F5F0FF"/>
+          </w:tcPr>
+          <w:p>
+            <w:pPr>
+              <w:spacing w:before="40" w:after="40" w:line="252" w:lineRule="auto"/>
+            </w:pPr>
+            <w:r>
+              <w:rPr>
+                <w:sz w:val="18"/>
+                <w:szCs w:val="18"/>
+              </w:rPr>
+              <w:t xml:space="preserve">Anything else</w:t>
+            </w:r>
+          </w:p>
+        </w:tc>
+        <w:tc>
+          <w:tcPr>
+            <w:tcW w:w="5560" w:type="dxa"/>
+            <w:shd w:val="clear" w:color="auto" w:fill="F5F0FF"/>
           </w:tcPr>
           <w:p>
             <w:pPr>

</xml_diff>

<commit_message>
docs: new Codespaces Setup guide (replaces Aug 2026 PDF)
The PDF predated the devcontainer: it had students install uv and Claude
Code by hand (via npm), warned against rebuilds that now self-repair,
pointed at the retired Student Handout, cited `claude auth login` (not in
Anthropic's docs) and had no /model or preflight step.

New TCA Codespaces Setup.docx, in the Prerequisites format: automatic
setup, preflight, paste-the-code login, /model Sonnet, ports, browser
shortcut clashes, timers, morning checklist. Prerequisites now send
Codespaces users there for Steps 2 to 6 (their files belong in
/workspaces, not ~).

Co-Authored-By: Claude Opus 5.5 <noreply@anthropic.com>
</commit_message>
<xml_diff>
--- a/docs/TCA Prerequisites.docx
+++ b/docs/TCA Prerequisites.docx
@@ -853,7 +853,7 @@
         <w:t xml:space="preserve">Codespaces Setup</w:t>
       </w:r>
       <w:r>
-        <w:t xml:space="preserve"> guide instead of Steps 2 and 3, then come back for Steps 4 to 6.</w:t>
+        <w:t xml:space="preserve"> guide instead of Steps 2 to 6. It covers logging in and the final check too.</w:t>
       </w:r>
     </w:p>
     <w:p>
@@ -1077,7 +1077,7 @@
                 <w:sz w:val="18"/>
                 <w:szCs w:val="18"/>
               </w:rPr>
-              <w:t xml:space="preserve"> guide, then Step 4 onwards</w:t>
+              <w:t xml:space="preserve"> guide, in place of Steps 2 to 6</w:t>
             </w:r>
           </w:p>
         </w:tc>
@@ -2024,7 +2024,7 @@
         <w:spacing w:after="140" w:line="276" w:lineRule="auto"/>
       </w:pPr>
       <w:r>
-        <w:t xml:space="preserve">Mac and Codespaces only; on Windows and Linux the script did this for you. Run this. </w:t>
+        <w:t xml:space="preserve">Mac only; on Windows and Linux the script did this for you. Run this. </w:t>
       </w:r>
       <w:r>
         <w:rPr>
@@ -2499,7 +2499,7 @@
           <w:b/>
           <w:bCs/>
         </w:rPr>
-        <w:t xml:space="preserve">Mac and Codespaces</w:t>
+        <w:t xml:space="preserve">Mac only</w:t>
       </w:r>
       <w:r>
         <w:t xml:space="preserve"> (on Windows and Linux the script already did this box, so skip it):</w:t>

</xml_diff>